<commit_message>
Rebuild Storyline course with visual activities and independent capstone
</commit_message>
<xml_diff>
--- a/courseware/LP-Mastering Articulate Storyline 360 for e-Learning Content Creation.docx
+++ b/courseware/LP-Mastering Articulate Storyline 360 for e-Learning Content Creation.docx
@@ -100,6 +100,45 @@
     </w:p>
     <w:p>
       <w:pPr>
+        <w:jc w:val="center"/>
+      </w:pPr>
+      <w:r>
+        <w:drawing>
+          <wp:inline xmlns:a="http://schemas.openxmlformats.org/drawingml/2006/main" xmlns:pic="http://schemas.openxmlformats.org/drawingml/2006/picture">
+            <wp:extent cx="914400" cy="264160"/>
+            <wp:docPr id="2" name="Picture 2"/>
+            <wp:cNvGraphicFramePr>
+              <a:graphicFrameLocks noChangeAspect="1"/>
+            </wp:cNvGraphicFramePr>
+            <a:graphic>
+              <a:graphicData uri="http://schemas.openxmlformats.org/drawingml/2006/picture">
+                <pic:pic>
+                  <pic:nvPicPr>
+                    <pic:cNvPr id="0" name="course-badge-story-choice.png"/>
+                    <pic:cNvPicPr/>
+                  </pic:nvPicPr>
+                  <pic:blipFill>
+                    <a:blip r:embed="rId10"/>
+                    <a:stretch>
+                      <a:fillRect/>
+                    </a:stretch>
+                  </pic:blipFill>
+                  <pic:spPr>
+                    <a:xfrm>
+                      <a:off x="0" y="0"/>
+                      <a:ext cx="914400" cy="264160"/>
+                    </a:xfrm>
+                    <a:prstGeom prst="rect"/>
+                  </pic:spPr>
+                </pic:pic>
+              </a:graphicData>
+            </a:graphic>
+          </wp:inline>
+        </w:drawing>
+      </w:r>
+    </w:p>
+    <w:p>
+      <w:pPr>
         <w:spacing w:before="80" w:after="40"/>
         <w:jc w:val="center"/>
       </w:pPr>
@@ -179,7 +218,7 @@
           <w:color w:val="1F6FEB"/>
           <w:sz w:val="24"/>
         </w:rPr>
-        <w:t>Version 10</w:t>
+        <w:t>Version 11</w:t>
       </w:r>
     </w:p>
     <w:p>
@@ -380,7 +419,7 @@
               <w:rPr>
                 <w:sz w:val="19"/>
               </w:rPr>
-              <w:t>Rebuilt 32-hour plan aligned to the 127-slide deck, nine Storyline labs and approved 60-minute WA plus 60-minute PP.</w:t>
+              <w:t>Rebuilt 32-hour plan aligned to the 127-slide deck, nine Storyline activities and approved 60-minute WA plus 60-minute PP.</w:t>
             </w:r>
           </w:p>
         </w:tc>
@@ -410,7 +449,7 @@
               <w:rPr>
                 <w:sz w:val="19"/>
               </w:rPr>
-              <w:t>10</w:t>
+              <w:t>10.0</w:t>
             </w:r>
           </w:p>
         </w:tc>
@@ -438,7 +477,65 @@
               <w:rPr>
                 <w:sz w:val="19"/>
               </w:rPr>
-              <w:t>Rebalanced the same 32-hour plan around 48 ebook-informed concepts and strengthened evidence criteria in all nine labs; assessment design unchanged.</w:t>
+              <w:t>Rebalanced the same 32-hour plan around 48 ebook-informed concepts and strengthened evidence criteria in all nine activities; assessment design unchanged.</w:t>
+            </w:r>
+          </w:p>
+        </w:tc>
+        <w:tc>
+          <w:tcPr>
+            <w:tcW w:type="dxa" w:w="2160"/>
+          </w:tcPr>
+          <w:p>
+            <w:r/>
+            <w:r>
+              <w:rPr>
+                <w:sz w:val="19"/>
+              </w:rPr>
+              <w:t>Dr Alfred Ang</w:t>
+            </w:r>
+          </w:p>
+        </w:tc>
+      </w:tr>
+      <w:tr>
+        <w:tc>
+          <w:tcPr>
+            <w:tcW w:type="dxa" w:w="2160"/>
+          </w:tcPr>
+          <w:p>
+            <w:r/>
+            <w:r>
+              <w:rPr>
+                <w:sz w:val="19"/>
+              </w:rPr>
+              <w:t>11</w:t>
+            </w:r>
+          </w:p>
+        </w:tc>
+        <w:tc>
+          <w:tcPr>
+            <w:tcW w:type="dxa" w:w="2160"/>
+          </w:tcPr>
+          <w:p>
+            <w:r/>
+            <w:r>
+              <w:rPr>
+                <w:sz w:val="19"/>
+              </w:rPr>
+              <w:t>17 October 2026</w:t>
+            </w:r>
+          </w:p>
+        </w:tc>
+        <w:tc>
+          <w:tcPr>
+            <w:tcW w:type="dxa" w:w="2160"/>
+          </w:tcPr>
+          <w:p>
+            <w:r/>
+            <w:r>
+              <w:rPr>
+                <w:sz w:val="19"/>
+              </w:rPr>
+              <w:t>Rebuilt the exact 32-hour plan as 15 hours theory, 15 hours practical and 2 hours approved assessment; added 14 connected safety activities with a 120-minute independent mini capstone.</w:t>
             </w:r>
           </w:p>
         </w:tc>
@@ -646,9 +743,18 @@
           <w:color w:val="333333"/>
           <w:sz w:val="22"/>
         </w:rPr>
-        <w:t>Lab Alignment</w:t>
+        <w:t>Activity Alignment</w:t>
         <w:tab/>
         <w:t>8</w:t>
+      </w:r>
+    </w:p>
+    <w:p>
+      <w:r>
+        <w:fldChar w:fldCharType="begin"/>
+        <w:instrText xml:space="preserve">TOC \o "1-3" \h \z \u</w:instrText>
+        <w:fldChar w:fldCharType="separate"/>
+        <w:t/>
+        <w:fldChar w:fldCharType="end"/>
       </w:r>
     </w:p>
     <w:p>
@@ -938,7 +1044,7 @@
               <w:rPr>
                 <w:sz w:val="19"/>
               </w:rPr>
-              <w:t>v10 · 22 August 2026</w:t>
+              <w:t>v11 · 17 October 2026</w:t>
             </w:r>
           </w:p>
         </w:tc>
@@ -1013,7 +1119,7 @@
         <w:pStyle w:val="ListBullet"/>
       </w:pPr>
       <w:r>
-        <w:t>Candidates must achieve Competent for every applicable knowledge and ability criterion. A minimum of 75% attendance is required.</w:t>
+        <w:t>Candidates must achieve Competent for every applicable knowledge and ability criterion. A minimum of 75% attendance is required. The independent Activity 14 mini capstone is developmental practice and is separate from the formal PP.</w:t>
       </w:r>
     </w:p>
     <w:p>
@@ -1146,7 +1252,7 @@
               <w:rPr>
                 <w:sz w:val="19"/>
               </w:rPr>
-              <w:t>09:00–10:00</w:t>
+              <w:t>09:30–11:30</w:t>
             </w:r>
           </w:p>
         </w:tc>
@@ -1160,7 +1266,7 @@
               <w:rPr>
                 <w:sz w:val="19"/>
               </w:rPr>
-              <w:t>60 min</w:t>
+              <w:t>120 min</w:t>
             </w:r>
           </w:p>
         </w:tc>
@@ -1174,7 +1280,7 @@
               <w:rPr>
                 <w:sz w:val="19"/>
               </w:rPr>
-              <w:t>Admin</w:t>
+              <w:t>Theory</w:t>
             </w:r>
           </w:p>
         </w:tc>
@@ -1188,7 +1294,7 @@
               <w:rPr>
                 <w:sz w:val="19"/>
               </w:rPr>
-              <w:t>Attendance, introductions, materials, outcomes and assessment design</w:t>
+              <w:t>WSQ administration; TSC/LO; interface, project, story and scene architecture</w:t>
             </w:r>
           </w:p>
         </w:tc>
@@ -1202,7 +1308,7 @@
               <w:rPr>
                 <w:sz w:val="19"/>
               </w:rPr>
-              <w:t>Slides 1–16</w:t>
+              <w:t>Topic 1 · slide 18 onward</w:t>
             </w:r>
           </w:p>
         </w:tc>
@@ -1221,7 +1327,7 @@
               <w:rPr>
                 <w:sz w:val="19"/>
               </w:rPr>
-              <w:t>10:00–11:30</w:t>
+              <w:t>11:30–13:30</w:t>
             </w:r>
           </w:p>
         </w:tc>
@@ -1235,7 +1341,7 @@
               <w:rPr>
                 <w:sz w:val="19"/>
               </w:rPr>
-              <w:t>90 min</w:t>
+              <w:t>120 min</w:t>
             </w:r>
           </w:p>
         </w:tc>
@@ -1249,7 +1355,7 @@
               <w:rPr>
                 <w:sz w:val="19"/>
               </w:rPr>
-              <w:t>Topic 1</w:t>
+              <w:t>Practical</w:t>
             </w:r>
           </w:p>
         </w:tc>
@@ -1263,7 +1369,7 @@
               <w:rPr>
                 <w:sz w:val="19"/>
               </w:rPr>
-              <w:t>Performance gaps, digital storytelling, content promise and storyboard architecture</w:t>
+              <w:t>Activities 01–02: blank project, storyboard, theme, masters and menu</w:t>
             </w:r>
           </w:p>
         </w:tc>
@@ -1277,7 +1383,7 @@
               <w:rPr>
                 <w:sz w:val="19"/>
               </w:rPr>
-              <w:t>Topic 1 begins at slide 17</w:t>
+              <w:t>Activity slides 77, 85</w:t>
             </w:r>
           </w:p>
         </w:tc>
@@ -1296,157 +1402,7 @@
               <w:rPr>
                 <w:sz w:val="19"/>
               </w:rPr>
-              <w:t>11:30–11:45</w:t>
-            </w:r>
-          </w:p>
-        </w:tc>
-        <w:tc>
-          <w:tcPr>
-            <w:tcW w:type="dxa" w:w="893"/>
-            <w:vAlign w:val="center"/>
-          </w:tcPr>
-          <w:p>
-            <w:r>
-              <w:rPr>
-                <w:sz w:val="19"/>
-              </w:rPr>
-              <w:t>15 min</w:t>
-            </w:r>
-          </w:p>
-        </w:tc>
-        <w:tc>
-          <w:tcPr>
-            <w:tcW w:type="dxa" w:w="1037"/>
-            <w:vAlign w:val="center"/>
-          </w:tcPr>
-          <w:p>
-            <w:r>
-              <w:rPr>
-                <w:sz w:val="19"/>
-              </w:rPr>
-              <w:t>Break</w:t>
-            </w:r>
-          </w:p>
-        </w:tc>
-        <w:tc>
-          <w:tcPr>
-            <w:tcW w:type="dxa" w:w="4104"/>
-            <w:vAlign w:val="center"/>
-          </w:tcPr>
-          <w:p>
-            <w:r>
-              <w:rPr>
-                <w:sz w:val="19"/>
-              </w:rPr>
-              <w:t>Tea break</w:t>
-            </w:r>
-          </w:p>
-        </w:tc>
-        <w:tc>
-          <w:tcPr>
-            <w:tcW w:type="dxa" w:w="2088"/>
-            <w:vAlign w:val="center"/>
-          </w:tcPr>
-          <w:p>
-            <w:r>
-              <w:rPr>
-                <w:sz w:val="19"/>
-              </w:rPr>
-              <w:t>—</w:t>
-            </w:r>
-          </w:p>
-        </w:tc>
-      </w:tr>
-      <w:tr>
-        <w:trPr>
-          <w:cantSplit/>
-        </w:trPr>
-        <w:tc>
-          <w:tcPr>
-            <w:tcW w:type="dxa" w:w="1037"/>
-            <w:vAlign w:val="center"/>
-          </w:tcPr>
-          <w:p>
-            <w:r>
-              <w:rPr>
-                <w:sz w:val="19"/>
-              </w:rPr>
-              <w:t>11:45–13:00</w:t>
-            </w:r>
-          </w:p>
-        </w:tc>
-        <w:tc>
-          <w:tcPr>
-            <w:tcW w:type="dxa" w:w="893"/>
-            <w:vAlign w:val="center"/>
-          </w:tcPr>
-          <w:p>
-            <w:r>
-              <w:rPr>
-                <w:sz w:val="19"/>
-              </w:rPr>
-              <w:t>75 min</w:t>
-            </w:r>
-          </w:p>
-        </w:tc>
-        <w:tc>
-          <w:tcPr>
-            <w:tcW w:type="dxa" w:w="1037"/>
-            <w:vAlign w:val="center"/>
-          </w:tcPr>
-          <w:p>
-            <w:r>
-              <w:rPr>
-                <w:sz w:val="19"/>
-              </w:rPr>
-              <w:t>Topic 1</w:t>
-            </w:r>
-          </w:p>
-        </w:tc>
-        <w:tc>
-          <w:tcPr>
-            <w:tcW w:type="dxa" w:w="4104"/>
-            <w:vAlign w:val="center"/>
-          </w:tcPr>
-          <w:p>
-            <w:r>
-              <w:rPr>
-                <w:sz w:val="19"/>
-              </w:rPr>
-              <w:t>Project model, interface, Story View, scenes, slides and layers</w:t>
-            </w:r>
-          </w:p>
-        </w:tc>
-        <w:tc>
-          <w:tcPr>
-            <w:tcW w:type="dxa" w:w="2088"/>
-            <w:vAlign w:val="center"/>
-          </w:tcPr>
-          <w:p>
-            <w:r>
-              <w:rPr>
-                <w:sz w:val="19"/>
-              </w:rPr>
-              <w:t>Topic 1: slide 17 onward</w:t>
-            </w:r>
-          </w:p>
-        </w:tc>
-      </w:tr>
-      <w:tr>
-        <w:trPr>
-          <w:cantSplit/>
-        </w:trPr>
-        <w:tc>
-          <w:tcPr>
-            <w:tcW w:type="dxa" w:w="1037"/>
-            <w:vAlign w:val="center"/>
-          </w:tcPr>
-          <w:p>
-            <w:r>
-              <w:rPr>
-                <w:sz w:val="19"/>
-              </w:rPr>
-              <w:t>13:00–14:00</w:t>
+              <w:t>13:30–14:30</w:t>
             </w:r>
           </w:p>
         </w:tc>
@@ -1521,7 +1477,7 @@
               <w:rPr>
                 <w:sz w:val="19"/>
               </w:rPr>
-              <w:t>14:00–15:30</w:t>
+              <w:t>14:30–16:30</w:t>
             </w:r>
           </w:p>
         </w:tc>
@@ -1535,7 +1491,7 @@
               <w:rPr>
                 <w:sz w:val="19"/>
               </w:rPr>
-              <w:t>90 min</w:t>
+              <w:t>120 min</w:t>
             </w:r>
           </w:p>
         </w:tc>
@@ -1549,7 +1505,7 @@
               <w:rPr>
                 <w:sz w:val="19"/>
               </w:rPr>
-              <w:t>Topic 1</w:t>
+              <w:t>Theory</w:t>
             </w:r>
           </w:p>
         </w:tc>
@@ -1563,7 +1519,7 @@
               <w:rPr>
                 <w:sz w:val="19"/>
               </w:rPr>
-              <w:t>Prototype reviews, question slides, result logic, question banks and media libraries</w:t>
+              <w:t>Slide size, variables, navigation plus player, translation and Review 360</w:t>
             </w:r>
           </w:p>
         </w:tc>
@@ -1577,7 +1533,7 @@
               <w:rPr>
                 <w:sz w:val="19"/>
               </w:rPr>
-              <w:t>Topic 1: slide 17 onward</w:t>
+              <w:t>Topics 1 and 4 · slide 18 onward</w:t>
             </w:r>
           </w:p>
         </w:tc>
@@ -1596,7 +1552,7 @@
               <w:rPr>
                 <w:sz w:val="19"/>
               </w:rPr>
-              <w:t>15:30–15:45</w:t>
+              <w:t>16:30–17:30</w:t>
             </w:r>
           </w:p>
         </w:tc>
@@ -1610,7 +1566,7 @@
               <w:rPr>
                 <w:sz w:val="19"/>
               </w:rPr>
-              <w:t>15 min</w:t>
+              <w:t>60 min</w:t>
             </w:r>
           </w:p>
         </w:tc>
@@ -1624,7 +1580,7 @@
               <w:rPr>
                 <w:sz w:val="19"/>
               </w:rPr>
-              <w:t>Break</w:t>
+              <w:t>Practical</w:t>
             </w:r>
           </w:p>
         </w:tc>
@@ -1638,7 +1594,7 @@
               <w:rPr>
                 <w:sz w:val="19"/>
               </w:rPr>
-              <w:t>Tea break</w:t>
+              <w:t>Activities 01–02 checkpoint build and evidence</w:t>
             </w:r>
           </w:p>
         </w:tc>
@@ -1652,82 +1608,7 @@
               <w:rPr>
                 <w:sz w:val="19"/>
               </w:rPr>
-              <w:t>—</w:t>
-            </w:r>
-          </w:p>
-        </w:tc>
-      </w:tr>
-      <w:tr>
-        <w:trPr>
-          <w:cantSplit/>
-        </w:trPr>
-        <w:tc>
-          <w:tcPr>
-            <w:tcW w:type="dxa" w:w="1037"/>
-            <w:vAlign w:val="center"/>
-          </w:tcPr>
-          <w:p>
-            <w:r>
-              <w:rPr>
-                <w:sz w:val="19"/>
-              </w:rPr>
-              <w:t>15:45–17:30</w:t>
-            </w:r>
-          </w:p>
-        </w:tc>
-        <w:tc>
-          <w:tcPr>
-            <w:tcW w:type="dxa" w:w="893"/>
-            <w:vAlign w:val="center"/>
-          </w:tcPr>
-          <w:p>
-            <w:r>
-              <w:rPr>
-                <w:sz w:val="19"/>
-              </w:rPr>
-              <w:t>105 min</w:t>
-            </w:r>
-          </w:p>
-        </w:tc>
-        <w:tc>
-          <w:tcPr>
-            <w:tcW w:type="dxa" w:w="1037"/>
-            <w:vAlign w:val="center"/>
-          </w:tcPr>
-          <w:p>
-            <w:r>
-              <w:rPr>
-                <w:sz w:val="19"/>
-              </w:rPr>
-              <w:t>Labs 1–2</w:t>
-            </w:r>
-          </w:p>
-        </w:tc>
-        <w:tc>
-          <w:tcPr>
-            <w:tcW w:type="dxa" w:w="4104"/>
-            <w:vAlign w:val="center"/>
-          </w:tcPr>
-          <w:p>
-            <w:r>
-              <w:rPr>
-                <w:sz w:val="19"/>
-              </w:rPr>
-              <w:t>Theme/media replacement and storyboard-content build</w:t>
-            </w:r>
-          </w:p>
-        </w:tc>
-        <w:tc>
-          <w:tcPr>
-            <w:tcW w:type="dxa" w:w="2088"/>
-            <w:vAlign w:val="center"/>
-          </w:tcPr>
-          <w:p>
-            <w:r>
-              <w:rPr>
-                <w:sz w:val="19"/>
-              </w:rPr>
-              <w:t>Lab slides 43, 44</w:t>
+              <w:t>HarbourLink-WSH-Checkpoint-02</w:t>
             </w:r>
           </w:p>
         </w:tc>
@@ -1774,7 +1655,7 @@
               <w:rPr>
                 <w:sz w:val="19"/>
               </w:rPr>
-              <w:t>Checkpoint</w:t>
+              <w:t>Practical</w:t>
             </w:r>
           </w:p>
         </w:tc>
@@ -1788,7 +1669,7 @@
               <w:rPr>
                 <w:sz w:val="19"/>
               </w:rPr>
-              <w:t>Guided Storyline practice, evidence review and PM attendance</w:t>
+              <w:t>Activities 01–02 checkpoint build, evidence and correction</w:t>
             </w:r>
           </w:p>
         </w:tc>
@@ -1802,7 +1683,7 @@
               <w:rPr>
                 <w:sz w:val="19"/>
               </w:rPr>
-              <w:t>Topic 1 checkpoint</w:t>
+              <w:t>HarbourLink-WSH-Checkpoint-02</w:t>
             </w:r>
           </w:p>
         </w:tc>
@@ -1930,7 +1811,7 @@
               <w:rPr>
                 <w:sz w:val="19"/>
               </w:rPr>
-              <w:t>09:00–09:30</w:t>
+              <w:t>09:30–11:30</w:t>
             </w:r>
           </w:p>
         </w:tc>
@@ -1944,7 +1825,7 @@
               <w:rPr>
                 <w:sz w:val="19"/>
               </w:rPr>
-              <w:t>30 min</w:t>
+              <w:t>120 min</w:t>
             </w:r>
           </w:p>
         </w:tc>
@@ -1958,7 +1839,7 @@
               <w:rPr>
                 <w:sz w:val="19"/>
               </w:rPr>
-              <w:t>Admin</w:t>
+              <w:t>Theory</w:t>
             </w:r>
           </w:p>
         </w:tc>
@@ -1972,7 +1853,7 @@
               <w:rPr>
                 <w:sz w:val="19"/>
               </w:rPr>
-              <w:t>AM attendance and Day 1 retrieval practice</w:t>
+              <w:t>Media Library, pictures, hazard hotspots, layers, states, triggers and variable gates</w:t>
             </w:r>
           </w:p>
         </w:tc>
@@ -1986,7 +1867,7 @@
               <w:rPr>
                 <w:sz w:val="19"/>
               </w:rPr>
-              <w:t>Recap</w:t>
+              <w:t>Topic 2 · slide 94 onward</w:t>
             </w:r>
           </w:p>
         </w:tc>
@@ -2005,7 +1886,7 @@
               <w:rPr>
                 <w:sz w:val="19"/>
               </w:rPr>
-              <w:t>09:30–11:15</w:t>
+              <w:t>11:30–13:30</w:t>
             </w:r>
           </w:p>
         </w:tc>
@@ -2019,7 +1900,7 @@
               <w:rPr>
                 <w:sz w:val="19"/>
               </w:rPr>
-              <w:t>105 min</w:t>
+              <w:t>120 min</w:t>
             </w:r>
           </w:p>
         </w:tc>
@@ -2033,7 +1914,7 @@
               <w:rPr>
                 <w:sz w:val="19"/>
               </w:rPr>
-              <w:t>Topic 2</w:t>
+              <w:t>Practical</w:t>
             </w:r>
           </w:p>
         </w:tc>
@@ -2047,7 +1928,7 @@
               <w:rPr>
                 <w:sz w:val="19"/>
               </w:rPr>
-              <w:t>Audience preferences, visual grammar, pictures, 360° media and video</w:t>
+              <w:t>Activities 03–04: hazard scene, layers, states, counter and gate</w:t>
             </w:r>
           </w:p>
         </w:tc>
@@ -2061,7 +1942,7 @@
               <w:rPr>
                 <w:sz w:val="19"/>
               </w:rPr>
-              <w:t>Topic 2 begins at slide 46</w:t>
+              <w:t>Activity slides 204, 212</w:t>
             </w:r>
           </w:p>
         </w:tc>
@@ -2080,157 +1961,7 @@
               <w:rPr>
                 <w:sz w:val="19"/>
               </w:rPr>
-              <w:t>11:15–11:30</w:t>
-            </w:r>
-          </w:p>
-        </w:tc>
-        <w:tc>
-          <w:tcPr>
-            <w:tcW w:type="dxa" w:w="893"/>
-            <w:vAlign w:val="center"/>
-          </w:tcPr>
-          <w:p>
-            <w:r>
-              <w:rPr>
-                <w:sz w:val="19"/>
-              </w:rPr>
-              <w:t>15 min</w:t>
-            </w:r>
-          </w:p>
-        </w:tc>
-        <w:tc>
-          <w:tcPr>
-            <w:tcW w:type="dxa" w:w="1037"/>
-            <w:vAlign w:val="center"/>
-          </w:tcPr>
-          <w:p>
-            <w:r>
-              <w:rPr>
-                <w:sz w:val="19"/>
-              </w:rPr>
-              <w:t>Break</w:t>
-            </w:r>
-          </w:p>
-        </w:tc>
-        <w:tc>
-          <w:tcPr>
-            <w:tcW w:type="dxa" w:w="4104"/>
-            <w:vAlign w:val="center"/>
-          </w:tcPr>
-          <w:p>
-            <w:r>
-              <w:rPr>
-                <w:sz w:val="19"/>
-              </w:rPr>
-              <w:t>Tea break</w:t>
-            </w:r>
-          </w:p>
-        </w:tc>
-        <w:tc>
-          <w:tcPr>
-            <w:tcW w:type="dxa" w:w="2088"/>
-            <w:vAlign w:val="center"/>
-          </w:tcPr>
-          <w:p>
-            <w:r>
-              <w:rPr>
-                <w:sz w:val="19"/>
-              </w:rPr>
-              <w:t>—</w:t>
-            </w:r>
-          </w:p>
-        </w:tc>
-      </w:tr>
-      <w:tr>
-        <w:trPr>
-          <w:cantSplit/>
-        </w:trPr>
-        <w:tc>
-          <w:tcPr>
-            <w:tcW w:type="dxa" w:w="1037"/>
-            <w:vAlign w:val="center"/>
-          </w:tcPr>
-          <w:p>
-            <w:r>
-              <w:rPr>
-                <w:sz w:val="19"/>
-              </w:rPr>
-              <w:t>11:30–13:00</w:t>
-            </w:r>
-          </w:p>
-        </w:tc>
-        <w:tc>
-          <w:tcPr>
-            <w:tcW w:type="dxa" w:w="893"/>
-            <w:vAlign w:val="center"/>
-          </w:tcPr>
-          <w:p>
-            <w:r>
-              <w:rPr>
-                <w:sz w:val="19"/>
-              </w:rPr>
-              <w:t>90 min</w:t>
-            </w:r>
-          </w:p>
-        </w:tc>
-        <w:tc>
-          <w:tcPr>
-            <w:tcW w:type="dxa" w:w="1037"/>
-            <w:vAlign w:val="center"/>
-          </w:tcPr>
-          <w:p>
-            <w:r>
-              <w:rPr>
-                <w:sz w:val="19"/>
-              </w:rPr>
-              <w:t>Topic 2</w:t>
-            </w:r>
-          </w:p>
-        </w:tc>
-        <w:tc>
-          <w:tcPr>
-            <w:tcW w:type="dxa" w:w="4104"/>
-            <w:vAlign w:val="center"/>
-          </w:tcPr>
-          <w:p>
-            <w:r>
-              <w:rPr>
-                <w:sz w:val="19"/>
-              </w:rPr>
-              <w:t>Video workflow, audio, captions, accessible equivalents, web objects and screen recordings</w:t>
-            </w:r>
-          </w:p>
-        </w:tc>
-        <w:tc>
-          <w:tcPr>
-            <w:tcW w:type="dxa" w:w="2088"/>
-            <w:vAlign w:val="center"/>
-          </w:tcPr>
-          <w:p>
-            <w:r>
-              <w:rPr>
-                <w:sz w:val="19"/>
-              </w:rPr>
-              <w:t>Topic 2: slide 46 onward</w:t>
-            </w:r>
-          </w:p>
-        </w:tc>
-      </w:tr>
-      <w:tr>
-        <w:trPr>
-          <w:cantSplit/>
-        </w:trPr>
-        <w:tc>
-          <w:tcPr>
-            <w:tcW w:type="dxa" w:w="1037"/>
-            <w:vAlign w:val="center"/>
-          </w:tcPr>
-          <w:p>
-            <w:r>
-              <w:rPr>
-                <w:sz w:val="19"/>
-              </w:rPr>
-              <w:t>13:00–14:00</w:t>
+              <w:t>13:30–14:30</w:t>
             </w:r>
           </w:p>
         </w:tc>
@@ -2305,157 +2036,7 @@
               <w:rPr>
                 <w:sz w:val="19"/>
               </w:rPr>
-              <w:t>14:00–15:15</w:t>
-            </w:r>
-          </w:p>
-        </w:tc>
-        <w:tc>
-          <w:tcPr>
-            <w:tcW w:type="dxa" w:w="893"/>
-            <w:vAlign w:val="center"/>
-          </w:tcPr>
-          <w:p>
-            <w:r>
-              <w:rPr>
-                <w:sz w:val="19"/>
-              </w:rPr>
-              <w:t>75 min</w:t>
-            </w:r>
-          </w:p>
-        </w:tc>
-        <w:tc>
-          <w:tcPr>
-            <w:tcW w:type="dxa" w:w="1037"/>
-            <w:vAlign w:val="center"/>
-          </w:tcPr>
-          <w:p>
-            <w:r>
-              <w:rPr>
-                <w:sz w:val="19"/>
-              </w:rPr>
-              <w:t>Topic 2</w:t>
-            </w:r>
-          </w:p>
-        </w:tc>
-        <w:tc>
-          <w:tcPr>
-            <w:tcW w:type="dxa" w:w="4104"/>
-            <w:vAlign w:val="center"/>
-          </w:tcPr>
-          <w:p>
-            <w:r>
-              <w:rPr>
-                <w:sz w:val="19"/>
-              </w:rPr>
-              <w:t>Native objects, text, tables, formatting and layout QA</w:t>
-            </w:r>
-          </w:p>
-        </w:tc>
-        <w:tc>
-          <w:tcPr>
-            <w:tcW w:type="dxa" w:w="2088"/>
-            <w:vAlign w:val="center"/>
-          </w:tcPr>
-          <w:p>
-            <w:r>
-              <w:rPr>
-                <w:sz w:val="19"/>
-              </w:rPr>
-              <w:t>Topic 2: slide 46 onward</w:t>
-            </w:r>
-          </w:p>
-        </w:tc>
-      </w:tr>
-      <w:tr>
-        <w:trPr>
-          <w:cantSplit/>
-        </w:trPr>
-        <w:tc>
-          <w:tcPr>
-            <w:tcW w:type="dxa" w:w="1037"/>
-            <w:vAlign w:val="center"/>
-          </w:tcPr>
-          <w:p>
-            <w:r>
-              <w:rPr>
-                <w:sz w:val="19"/>
-              </w:rPr>
-              <w:t>15:15–15:30</w:t>
-            </w:r>
-          </w:p>
-        </w:tc>
-        <w:tc>
-          <w:tcPr>
-            <w:tcW w:type="dxa" w:w="893"/>
-            <w:vAlign w:val="center"/>
-          </w:tcPr>
-          <w:p>
-            <w:r>
-              <w:rPr>
-                <w:sz w:val="19"/>
-              </w:rPr>
-              <w:t>15 min</w:t>
-            </w:r>
-          </w:p>
-        </w:tc>
-        <w:tc>
-          <w:tcPr>
-            <w:tcW w:type="dxa" w:w="1037"/>
-            <w:vAlign w:val="center"/>
-          </w:tcPr>
-          <w:p>
-            <w:r>
-              <w:rPr>
-                <w:sz w:val="19"/>
-              </w:rPr>
-              <w:t>Break</w:t>
-            </w:r>
-          </w:p>
-        </w:tc>
-        <w:tc>
-          <w:tcPr>
-            <w:tcW w:type="dxa" w:w="4104"/>
-            <w:vAlign w:val="center"/>
-          </w:tcPr>
-          <w:p>
-            <w:r>
-              <w:rPr>
-                <w:sz w:val="19"/>
-              </w:rPr>
-              <w:t>Tea break</w:t>
-            </w:r>
-          </w:p>
-        </w:tc>
-        <w:tc>
-          <w:tcPr>
-            <w:tcW w:type="dxa" w:w="2088"/>
-            <w:vAlign w:val="center"/>
-          </w:tcPr>
-          <w:p>
-            <w:r>
-              <w:rPr>
-                <w:sz w:val="19"/>
-              </w:rPr>
-              <w:t>—</w:t>
-            </w:r>
-          </w:p>
-        </w:tc>
-      </w:tr>
-      <w:tr>
-        <w:trPr>
-          <w:cantSplit/>
-        </w:trPr>
-        <w:tc>
-          <w:tcPr>
-            <w:tcW w:type="dxa" w:w="1037"/>
-            <w:vAlign w:val="center"/>
-          </w:tcPr>
-          <w:p>
-            <w:r>
-              <w:rPr>
-                <w:sz w:val="19"/>
-              </w:rPr>
-              <w:t>15:30–17:30</w:t>
+              <w:t>14:30–16:30</w:t>
             </w:r>
           </w:p>
         </w:tc>
@@ -2483,7 +2064,7 @@
               <w:rPr>
                 <w:sz w:val="19"/>
               </w:rPr>
-              <w:t>Labs 3–4</w:t>
+              <w:t>Theory</w:t>
             </w:r>
           </w:p>
         </w:tc>
@@ -2497,7 +2078,7 @@
               <w:rPr>
                 <w:sz w:val="19"/>
               </w:rPr>
-              <w:t>Audience-fit media curation and governed AI-assisted variation</w:t>
+              <w:t>Motion, simulation, captions plus SCORM 1.2/2004 reporting and ZIP structure</w:t>
             </w:r>
           </w:p>
         </w:tc>
@@ -2511,7 +2092,82 @@
               <w:rPr>
                 <w:sz w:val="19"/>
               </w:rPr>
-              <w:t>Lab slides 74, 75</w:t>
+              <w:t>Topics 2 and 4 · slide 94 onward</w:t>
+            </w:r>
+          </w:p>
+        </w:tc>
+      </w:tr>
+      <w:tr>
+        <w:trPr>
+          <w:cantSplit/>
+        </w:trPr>
+        <w:tc>
+          <w:tcPr>
+            <w:tcW w:type="dxa" w:w="1037"/>
+            <w:vAlign w:val="center"/>
+          </w:tcPr>
+          <w:p>
+            <w:r>
+              <w:rPr>
+                <w:sz w:val="19"/>
+              </w:rPr>
+              <w:t>16:30–17:30</w:t>
+            </w:r>
+          </w:p>
+        </w:tc>
+        <w:tc>
+          <w:tcPr>
+            <w:tcW w:type="dxa" w:w="893"/>
+            <w:vAlign w:val="center"/>
+          </w:tcPr>
+          <w:p>
+            <w:r>
+              <w:rPr>
+                <w:sz w:val="19"/>
+              </w:rPr>
+              <w:t>60 min</w:t>
+            </w:r>
+          </w:p>
+        </w:tc>
+        <w:tc>
+          <w:tcPr>
+            <w:tcW w:type="dxa" w:w="1037"/>
+            <w:vAlign w:val="center"/>
+          </w:tcPr>
+          <w:p>
+            <w:r>
+              <w:rPr>
+                <w:sz w:val="19"/>
+              </w:rPr>
+              <w:t>Practical</w:t>
+            </w:r>
+          </w:p>
+        </w:tc>
+        <w:tc>
+          <w:tcPr>
+            <w:tcW w:type="dxa" w:w="4104"/>
+            <w:vAlign w:val="center"/>
+          </w:tcPr>
+          <w:p>
+            <w:r>
+              <w:rPr>
+                <w:sz w:val="19"/>
+              </w:rPr>
+              <w:t>Activities 05–07 controls, simulation and accessibility</w:t>
+            </w:r>
+          </w:p>
+        </w:tc>
+        <w:tc>
+          <w:tcPr>
+            <w:tcW w:type="dxa" w:w="2088"/>
+            <w:vAlign w:val="center"/>
+          </w:tcPr>
+          <w:p>
+            <w:r>
+              <w:rPr>
+                <w:sz w:val="19"/>
+              </w:rPr>
+              <w:t>Activity slides 220, 228, 236</w:t>
             </w:r>
           </w:p>
         </w:tc>
@@ -2558,7 +2214,7 @@
               <w:rPr>
                 <w:sz w:val="19"/>
               </w:rPr>
-              <w:t>Checkpoint</w:t>
+              <w:t>Practical</w:t>
             </w:r>
           </w:p>
         </w:tc>
@@ -2572,7 +2228,7 @@
               <w:rPr>
                 <w:sz w:val="19"/>
               </w:rPr>
-              <w:t>Guided media/accessibility practice, provenance review and PM attendance</w:t>
+              <w:t>Activities 05–07 motion, simulation and accessible media test</w:t>
             </w:r>
           </w:p>
         </w:tc>
@@ -2586,7 +2242,7 @@
               <w:rPr>
                 <w:sz w:val="19"/>
               </w:rPr>
-              <w:t>Topic 2 checkpoint</w:t>
+              <w:t>Activity slides 220, 228, 236</w:t>
             </w:r>
           </w:p>
         </w:tc>
@@ -2714,7 +2370,7 @@
               <w:rPr>
                 <w:sz w:val="19"/>
               </w:rPr>
-              <w:t>09:00–09:30</w:t>
+              <w:t>09:30–11:30</w:t>
             </w:r>
           </w:p>
         </w:tc>
@@ -2728,7 +2384,7 @@
               <w:rPr>
                 <w:sz w:val="19"/>
               </w:rPr>
-              <w:t>30 min</w:t>
+              <w:t>120 min</w:t>
             </w:r>
           </w:p>
         </w:tc>
@@ -2742,7 +2398,7 @@
               <w:rPr>
                 <w:sz w:val="19"/>
               </w:rPr>
-              <w:t>Admin</w:t>
+              <w:t>Theory</w:t>
             </w:r>
           </w:p>
         </w:tc>
@@ -2756,7 +2412,7 @@
               <w:rPr>
                 <w:sz w:val="19"/>
               </w:rPr>
-              <w:t>AM attendance and Day 2 retrieval practice</w:t>
+              <w:t>Branching, freeform questions, feedback, question banks and controlled draws</w:t>
             </w:r>
           </w:p>
         </w:tc>
@@ -2770,7 +2426,7 @@
               <w:rPr>
                 <w:sz w:val="19"/>
               </w:rPr>
-              <w:t>Recap</w:t>
+              <w:t>Topic 3 · slide 245 onward</w:t>
             </w:r>
           </w:p>
         </w:tc>
@@ -2789,7 +2445,7 @@
               <w:rPr>
                 <w:sz w:val="19"/>
               </w:rPr>
-              <w:t>09:30–11:15</w:t>
+              <w:t>11:30–13:30</w:t>
             </w:r>
           </w:p>
         </w:tc>
@@ -2803,7 +2459,7 @@
               <w:rPr>
                 <w:sz w:val="19"/>
               </w:rPr>
-              <w:t>105 min</w:t>
+              <w:t>120 min</w:t>
             </w:r>
           </w:p>
         </w:tc>
@@ -2817,7 +2473,7 @@
               <w:rPr>
                 <w:sz w:val="19"/>
               </w:rPr>
-              <w:t>Topic 3</w:t>
+              <w:t>Practical</w:t>
             </w:r>
           </w:p>
         </w:tc>
@@ -2831,7 +2487,7 @@
               <w:rPr>
                 <w:sz w:val="19"/>
               </w:rPr>
-              <w:t>Meaningful choices, learner-controlled discovery, triggers, states and variables</w:t>
+              <w:t>Activities 08–09: branching decisions, freeform task and five-criterion quiz</w:t>
             </w:r>
           </w:p>
         </w:tc>
@@ -2845,7 +2501,7 @@
               <w:rPr>
                 <w:sz w:val="19"/>
               </w:rPr>
-              <w:t>Topic 3 begins at slide 79</w:t>
+              <w:t>Activity slides 298, 306</w:t>
             </w:r>
           </w:p>
         </w:tc>
@@ -2864,157 +2520,7 @@
               <w:rPr>
                 <w:sz w:val="19"/>
               </w:rPr>
-              <w:t>11:15–11:30</w:t>
-            </w:r>
-          </w:p>
-        </w:tc>
-        <w:tc>
-          <w:tcPr>
-            <w:tcW w:type="dxa" w:w="893"/>
-            <w:vAlign w:val="center"/>
-          </w:tcPr>
-          <w:p>
-            <w:r>
-              <w:rPr>
-                <w:sz w:val="19"/>
-              </w:rPr>
-              <w:t>15 min</w:t>
-            </w:r>
-          </w:p>
-        </w:tc>
-        <w:tc>
-          <w:tcPr>
-            <w:tcW w:type="dxa" w:w="1037"/>
-            <w:vAlign w:val="center"/>
-          </w:tcPr>
-          <w:p>
-            <w:r>
-              <w:rPr>
-                <w:sz w:val="19"/>
-              </w:rPr>
-              <w:t>Break</w:t>
-            </w:r>
-          </w:p>
-        </w:tc>
-        <w:tc>
-          <w:tcPr>
-            <w:tcW w:type="dxa" w:w="4104"/>
-            <w:vAlign w:val="center"/>
-          </w:tcPr>
-          <w:p>
-            <w:r>
-              <w:rPr>
-                <w:sz w:val="19"/>
-              </w:rPr>
-              <w:t>Tea break</w:t>
-            </w:r>
-          </w:p>
-        </w:tc>
-        <w:tc>
-          <w:tcPr>
-            <w:tcW w:type="dxa" w:w="2088"/>
-            <w:vAlign w:val="center"/>
-          </w:tcPr>
-          <w:p>
-            <w:r>
-              <w:rPr>
-                <w:sz w:val="19"/>
-              </w:rPr>
-              <w:t>—</w:t>
-            </w:r>
-          </w:p>
-        </w:tc>
-      </w:tr>
-      <w:tr>
-        <w:trPr>
-          <w:cantSplit/>
-        </w:trPr>
-        <w:tc>
-          <w:tcPr>
-            <w:tcW w:type="dxa" w:w="1037"/>
-            <w:vAlign w:val="center"/>
-          </w:tcPr>
-          <w:p>
-            <w:r>
-              <w:rPr>
-                <w:sz w:val="19"/>
-              </w:rPr>
-              <w:t>11:30–13:00</w:t>
-            </w:r>
-          </w:p>
-        </w:tc>
-        <w:tc>
-          <w:tcPr>
-            <w:tcW w:type="dxa" w:w="893"/>
-            <w:vAlign w:val="center"/>
-          </w:tcPr>
-          <w:p>
-            <w:r>
-              <w:rPr>
-                <w:sz w:val="19"/>
-              </w:rPr>
-              <w:t>90 min</w:t>
-            </w:r>
-          </w:p>
-        </w:tc>
-        <w:tc>
-          <w:tcPr>
-            <w:tcW w:type="dxa" w:w="1037"/>
-            <w:vAlign w:val="center"/>
-          </w:tcPr>
-          <w:p>
-            <w:r>
-              <w:rPr>
-                <w:sz w:val="19"/>
-              </w:rPr>
-              <w:t>Topic 3</w:t>
-            </w:r>
-          </w:p>
-        </w:tc>
-        <w:tc>
-          <w:tcPr>
-            <w:tcW w:type="dxa" w:w="4104"/>
-            <w:vAlign w:val="center"/>
-          </w:tcPr>
-          <w:p>
-            <w:r>
-              <w:rPr>
-                <w:sz w:val="19"/>
-              </w:rPr>
-              <w:t>Timeline, cue points, animation, freeform questions and branching</w:t>
-            </w:r>
-          </w:p>
-        </w:tc>
-        <w:tc>
-          <w:tcPr>
-            <w:tcW w:type="dxa" w:w="2088"/>
-            <w:vAlign w:val="center"/>
-          </w:tcPr>
-          <w:p>
-            <w:r>
-              <w:rPr>
-                <w:sz w:val="19"/>
-              </w:rPr>
-              <w:t>Topic 3: slide 79 onward</w:t>
-            </w:r>
-          </w:p>
-        </w:tc>
-      </w:tr>
-      <w:tr>
-        <w:trPr>
-          <w:cantSplit/>
-        </w:trPr>
-        <w:tc>
-          <w:tcPr>
-            <w:tcW w:type="dxa" w:w="1037"/>
-            <w:vAlign w:val="center"/>
-          </w:tcPr>
-          <w:p>
-            <w:r>
-              <w:rPr>
-                <w:sz w:val="19"/>
-              </w:rPr>
-              <w:t>13:00–14:00</w:t>
+              <w:t>13:30–14:30</w:t>
             </w:r>
           </w:p>
         </w:tc>
@@ -3089,157 +2595,7 @@
               <w:rPr>
                 <w:sz w:val="19"/>
               </w:rPr>
-              <w:t>14:00–15:15</w:t>
-            </w:r>
-          </w:p>
-        </w:tc>
-        <w:tc>
-          <w:tcPr>
-            <w:tcW w:type="dxa" w:w="893"/>
-            <w:vAlign w:val="center"/>
-          </w:tcPr>
-          <w:p>
-            <w:r>
-              <w:rPr>
-                <w:sz w:val="19"/>
-              </w:rPr>
-              <w:t>75 min</w:t>
-            </w:r>
-          </w:p>
-        </w:tc>
-        <w:tc>
-          <w:tcPr>
-            <w:tcW w:type="dxa" w:w="1037"/>
-            <w:vAlign w:val="center"/>
-          </w:tcPr>
-          <w:p>
-            <w:r>
-              <w:rPr>
-                <w:sz w:val="19"/>
-              </w:rPr>
-              <w:t>Labs 5–6</w:t>
-            </w:r>
-          </w:p>
-        </w:tc>
-        <w:tc>
-          <w:tcPr>
-            <w:tcW w:type="dxa" w:w="4104"/>
-            <w:vAlign w:val="center"/>
-          </w:tcPr>
-          <w:p>
-            <w:r>
-              <w:rPr>
-                <w:sz w:val="19"/>
-              </w:rPr>
-              <w:t>Narration, captions and scene-wide accessibility</w:t>
-            </w:r>
-          </w:p>
-        </w:tc>
-        <w:tc>
-          <w:tcPr>
-            <w:tcW w:type="dxa" w:w="2088"/>
-            <w:vAlign w:val="center"/>
-          </w:tcPr>
-          <w:p>
-            <w:r>
-              <w:rPr>
-                <w:sz w:val="19"/>
-              </w:rPr>
-              <w:t>Lab slides 76, 77</w:t>
-            </w:r>
-          </w:p>
-        </w:tc>
-      </w:tr>
-      <w:tr>
-        <w:trPr>
-          <w:cantSplit/>
-        </w:trPr>
-        <w:tc>
-          <w:tcPr>
-            <w:tcW w:type="dxa" w:w="1037"/>
-            <w:vAlign w:val="center"/>
-          </w:tcPr>
-          <w:p>
-            <w:r>
-              <w:rPr>
-                <w:sz w:val="19"/>
-              </w:rPr>
-              <w:t>15:15–15:30</w:t>
-            </w:r>
-          </w:p>
-        </w:tc>
-        <w:tc>
-          <w:tcPr>
-            <w:tcW w:type="dxa" w:w="893"/>
-            <w:vAlign w:val="center"/>
-          </w:tcPr>
-          <w:p>
-            <w:r>
-              <w:rPr>
-                <w:sz w:val="19"/>
-              </w:rPr>
-              <w:t>15 min</w:t>
-            </w:r>
-          </w:p>
-        </w:tc>
-        <w:tc>
-          <w:tcPr>
-            <w:tcW w:type="dxa" w:w="1037"/>
-            <w:vAlign w:val="center"/>
-          </w:tcPr>
-          <w:p>
-            <w:r>
-              <w:rPr>
-                <w:sz w:val="19"/>
-              </w:rPr>
-              <w:t>Break</w:t>
-            </w:r>
-          </w:p>
-        </w:tc>
-        <w:tc>
-          <w:tcPr>
-            <w:tcW w:type="dxa" w:w="4104"/>
-            <w:vAlign w:val="center"/>
-          </w:tcPr>
-          <w:p>
-            <w:r>
-              <w:rPr>
-                <w:sz w:val="19"/>
-              </w:rPr>
-              <w:t>Tea break</w:t>
-            </w:r>
-          </w:p>
-        </w:tc>
-        <w:tc>
-          <w:tcPr>
-            <w:tcW w:type="dxa" w:w="2088"/>
-            <w:vAlign w:val="center"/>
-          </w:tcPr>
-          <w:p>
-            <w:r>
-              <w:rPr>
-                <w:sz w:val="19"/>
-              </w:rPr>
-              <w:t>—</w:t>
-            </w:r>
-          </w:p>
-        </w:tc>
-      </w:tr>
-      <w:tr>
-        <w:trPr>
-          <w:cantSplit/>
-        </w:trPr>
-        <w:tc>
-          <w:tcPr>
-            <w:tcW w:type="dxa" w:w="1037"/>
-            <w:vAlign w:val="center"/>
-          </w:tcPr>
-          <w:p>
-            <w:r>
-              <w:rPr>
-                <w:sz w:val="19"/>
-              </w:rPr>
-              <w:t>15:30–17:30</w:t>
+              <w:t>14:30–16:30</w:t>
             </w:r>
           </w:p>
         </w:tc>
@@ -3267,7 +2623,7 @@
               <w:rPr>
                 <w:sz w:val="19"/>
               </w:rPr>
-              <w:t>Labs 7–8</w:t>
+              <w:t>Theory</w:t>
             </w:r>
           </w:p>
         </w:tc>
@@ -3281,7 +2637,7 @@
               <w:rPr>
                 <w:sz w:val="19"/>
               </w:rPr>
-              <w:t>Graded question, multi-question quiz and result logic</w:t>
+              <w:t>Results, retry/review, completion plus xAPI/cmi5 tracking boundaries</w:t>
             </w:r>
           </w:p>
         </w:tc>
@@ -3295,7 +2651,82 @@
               <w:rPr>
                 <w:sz w:val="19"/>
               </w:rPr>
-              <w:t>Lab slides 105, 106</w:t>
+              <w:t>Topics 3 and 4 · slide 245 onward</w:t>
+            </w:r>
+          </w:p>
+        </w:tc>
+      </w:tr>
+      <w:tr>
+        <w:trPr>
+          <w:cantSplit/>
+        </w:trPr>
+        <w:tc>
+          <w:tcPr>
+            <w:tcW w:type="dxa" w:w="1037"/>
+            <w:vAlign w:val="center"/>
+          </w:tcPr>
+          <w:p>
+            <w:r>
+              <w:rPr>
+                <w:sz w:val="19"/>
+              </w:rPr>
+              <w:t>16:30–17:30</w:t>
+            </w:r>
+          </w:p>
+        </w:tc>
+        <w:tc>
+          <w:tcPr>
+            <w:tcW w:type="dxa" w:w="893"/>
+            <w:vAlign w:val="center"/>
+          </w:tcPr>
+          <w:p>
+            <w:r>
+              <w:rPr>
+                <w:sz w:val="19"/>
+              </w:rPr>
+              <w:t>60 min</w:t>
+            </w:r>
+          </w:p>
+        </w:tc>
+        <w:tc>
+          <w:tcPr>
+            <w:tcW w:type="dxa" w:w="1037"/>
+            <w:vAlign w:val="center"/>
+          </w:tcPr>
+          <w:p>
+            <w:r>
+              <w:rPr>
+                <w:sz w:val="19"/>
+              </w:rPr>
+              <w:t>Practical</w:t>
+            </w:r>
+          </w:p>
+        </w:tc>
+        <w:tc>
+          <w:tcPr>
+            <w:tcW w:type="dxa" w:w="4104"/>
+            <w:vAlign w:val="center"/>
+          </w:tcPr>
+          <w:p>
+            <w:r>
+              <w:rPr>
+                <w:sz w:val="19"/>
+              </w:rPr>
+              <w:t>Activity 10 results and fail/pass/retry/resume</w:t>
+            </w:r>
+          </w:p>
+        </w:tc>
+        <w:tc>
+          <w:tcPr>
+            <w:tcW w:type="dxa" w:w="2088"/>
+            <w:vAlign w:val="center"/>
+          </w:tcPr>
+          <w:p>
+            <w:r>
+              <w:rPr>
+                <w:sz w:val="19"/>
+              </w:rPr>
+              <w:t>Activity slide 314</w:t>
             </w:r>
           </w:p>
         </w:tc>
@@ -3342,7 +2773,7 @@
               <w:rPr>
                 <w:sz w:val="19"/>
               </w:rPr>
-              <w:t>Checkpoint</w:t>
+              <w:t>Practical</w:t>
             </w:r>
           </w:p>
         </w:tc>
@@ -3356,7 +2787,7 @@
               <w:rPr>
                 <w:sz w:val="19"/>
               </w:rPr>
-              <w:t>Guided interaction testing, evidence review and PM attendance</w:t>
+              <w:t>Activity 10 results, retry and resume regression</w:t>
             </w:r>
           </w:p>
         </w:tc>
@@ -3370,7 +2801,7 @@
               <w:rPr>
                 <w:sz w:val="19"/>
               </w:rPr>
-              <w:t>Topic 3 checkpoint</w:t>
+              <w:t>HarbourLink-WSH-Checkpoint-10</w:t>
             </w:r>
           </w:p>
         </w:tc>
@@ -3498,7 +2929,7 @@
               <w:rPr>
                 <w:sz w:val="19"/>
               </w:rPr>
-              <w:t>09:00–09:30</w:t>
+              <w:t>09:30–11:30</w:t>
             </w:r>
           </w:p>
         </w:tc>
@@ -3512,7 +2943,7 @@
               <w:rPr>
                 <w:sz w:val="19"/>
               </w:rPr>
-              <w:t>30 min</w:t>
+              <w:t>120 min</w:t>
             </w:r>
           </w:p>
         </w:tc>
@@ -3526,7 +2957,7 @@
               <w:rPr>
                 <w:sz w:val="19"/>
               </w:rPr>
-              <w:t>Admin</w:t>
+              <w:t>Theory</w:t>
             </w:r>
           </w:p>
         </w:tc>
@@ -3540,7 +2971,7 @@
               <w:rPr>
                 <w:sz w:val="19"/>
               </w:rPr>
-              <w:t>AM attendance and Day 3 retrieval practice</w:t>
+              <w:t>Player accessibility, translation, Review 360, SCORM 1.2/2004 and publish ZIP</w:t>
             </w:r>
           </w:p>
         </w:tc>
@@ -3554,7 +2985,7 @@
               <w:rPr>
                 <w:sz w:val="19"/>
               </w:rPr>
-              <w:t>Recap</w:t>
+              <w:t>Topic 4 · slide 323 onward; Activities 11–12 demonstrated</w:t>
             </w:r>
           </w:p>
         </w:tc>
@@ -3573,7 +3004,7 @@
               <w:rPr>
                 <w:sz w:val="19"/>
               </w:rPr>
-              <w:t>09:30–11:00</w:t>
+              <w:t>11:30–12:30</w:t>
             </w:r>
           </w:p>
         </w:tc>
@@ -3587,7 +3018,7 @@
               <w:rPr>
                 <w:sz w:val="19"/>
               </w:rPr>
-              <w:t>90 min</w:t>
+              <w:t>60 min</w:t>
             </w:r>
           </w:p>
         </w:tc>
@@ -3601,7 +3032,7 @@
               <w:rPr>
                 <w:sz w:val="19"/>
               </w:rPr>
-              <w:t>Topic 4</w:t>
+              <w:t>Theory</w:t>
             </w:r>
           </w:p>
         </w:tc>
@@ -3615,7 +3046,7 @@
               <w:rPr>
                 <w:sz w:val="19"/>
               </w:rPr>
-              <w:t>Themes, masters, player, multi-device UX, accessibility and Review 360</w:t>
+              <w:t>Tin Can xAPI, cmi5 boundary, LMS/LRS validation, release retention and Activities sandbox boundary</w:t>
             </w:r>
           </w:p>
         </w:tc>
@@ -3629,157 +3060,7 @@
               <w:rPr>
                 <w:sz w:val="19"/>
               </w:rPr>
-              <w:t>Topic 4 begins at slide 108</w:t>
-            </w:r>
-          </w:p>
-        </w:tc>
-      </w:tr>
-      <w:tr>
-        <w:trPr>
-          <w:cantSplit/>
-        </w:trPr>
-        <w:tc>
-          <w:tcPr>
-            <w:tcW w:type="dxa" w:w="1037"/>
-            <w:vAlign w:val="center"/>
-          </w:tcPr>
-          <w:p>
-            <w:r>
-              <w:rPr>
-                <w:sz w:val="19"/>
-              </w:rPr>
-              <w:t>11:00–11:15</w:t>
-            </w:r>
-          </w:p>
-        </w:tc>
-        <w:tc>
-          <w:tcPr>
-            <w:tcW w:type="dxa" w:w="893"/>
-            <w:vAlign w:val="center"/>
-          </w:tcPr>
-          <w:p>
-            <w:r>
-              <w:rPr>
-                <w:sz w:val="19"/>
-              </w:rPr>
-              <w:t>15 min</w:t>
-            </w:r>
-          </w:p>
-        </w:tc>
-        <w:tc>
-          <w:tcPr>
-            <w:tcW w:type="dxa" w:w="1037"/>
-            <w:vAlign w:val="center"/>
-          </w:tcPr>
-          <w:p>
-            <w:r>
-              <w:rPr>
-                <w:sz w:val="19"/>
-              </w:rPr>
-              <w:t>Break</w:t>
-            </w:r>
-          </w:p>
-        </w:tc>
-        <w:tc>
-          <w:tcPr>
-            <w:tcW w:type="dxa" w:w="4104"/>
-            <w:vAlign w:val="center"/>
-          </w:tcPr>
-          <w:p>
-            <w:r>
-              <w:rPr>
-                <w:sz w:val="19"/>
-              </w:rPr>
-              <w:t>Tea break</w:t>
-            </w:r>
-          </w:p>
-        </w:tc>
-        <w:tc>
-          <w:tcPr>
-            <w:tcW w:type="dxa" w:w="2088"/>
-            <w:vAlign w:val="center"/>
-          </w:tcPr>
-          <w:p>
-            <w:r>
-              <w:rPr>
-                <w:sz w:val="19"/>
-              </w:rPr>
-              <w:t>—</w:t>
-            </w:r>
-          </w:p>
-        </w:tc>
-      </w:tr>
-      <w:tr>
-        <w:trPr>
-          <w:cantSplit/>
-        </w:trPr>
-        <w:tc>
-          <w:tcPr>
-            <w:tcW w:type="dxa" w:w="1037"/>
-            <w:vAlign w:val="center"/>
-          </w:tcPr>
-          <w:p>
-            <w:r>
-              <w:rPr>
-                <w:sz w:val="19"/>
-              </w:rPr>
-              <w:t>11:15–12:30</w:t>
-            </w:r>
-          </w:p>
-        </w:tc>
-        <w:tc>
-          <w:tcPr>
-            <w:tcW w:type="dxa" w:w="893"/>
-            <w:vAlign w:val="center"/>
-          </w:tcPr>
-          <w:p>
-            <w:r>
-              <w:rPr>
-                <w:sz w:val="19"/>
-              </w:rPr>
-              <w:t>75 min</w:t>
-            </w:r>
-          </w:p>
-        </w:tc>
-        <w:tc>
-          <w:tcPr>
-            <w:tcW w:type="dxa" w:w="1037"/>
-            <w:vAlign w:val="center"/>
-          </w:tcPr>
-          <w:p>
-            <w:r>
-              <w:rPr>
-                <w:sz w:val="19"/>
-              </w:rPr>
-              <w:t>Topic 4</w:t>
-            </w:r>
-          </w:p>
-        </w:tc>
-        <w:tc>
-          <w:tcPr>
-            <w:tcW w:type="dxa" w:w="4104"/>
-            <w:vAlign w:val="center"/>
-          </w:tcPr>
-          <w:p>
-            <w:r>
-              <w:rPr>
-                <w:sz w:val="19"/>
-              </w:rPr>
-              <w:t>Preview strategy, publishing channels, LMS/LRS standards and tracking</w:t>
-            </w:r>
-          </w:p>
-        </w:tc>
-        <w:tc>
-          <w:tcPr>
-            <w:tcW w:type="dxa" w:w="2088"/>
-            <w:vAlign w:val="center"/>
-          </w:tcPr>
-          <w:p>
-            <w:r>
-              <w:rPr>
-                <w:sz w:val="19"/>
-              </w:rPr>
-              <w:t>Topic 4: slide 108 onward</w:t>
+              <w:t>Topic 4 · Activities 13–14 briefing</w:t>
             </w:r>
           </w:p>
         </w:tc>
@@ -3873,157 +3154,7 @@
               <w:rPr>
                 <w:sz w:val="19"/>
               </w:rPr>
-              <w:t>13:30–14:45</w:t>
-            </w:r>
-          </w:p>
-        </w:tc>
-        <w:tc>
-          <w:tcPr>
-            <w:tcW w:type="dxa" w:w="893"/>
-            <w:vAlign w:val="center"/>
-          </w:tcPr>
-          <w:p>
-            <w:r>
-              <w:rPr>
-                <w:sz w:val="19"/>
-              </w:rPr>
-              <w:t>75 min</w:t>
-            </w:r>
-          </w:p>
-        </w:tc>
-        <w:tc>
-          <w:tcPr>
-            <w:tcW w:type="dxa" w:w="1037"/>
-            <w:vAlign w:val="center"/>
-          </w:tcPr>
-          <w:p>
-            <w:r>
-              <w:rPr>
-                <w:sz w:val="19"/>
-              </w:rPr>
-              <w:t>Topic 4</w:t>
-            </w:r>
-          </w:p>
-        </w:tc>
-        <w:tc>
-          <w:tcPr>
-            <w:tcW w:type="dxa" w:w="4104"/>
-            <w:vAlign w:val="center"/>
-          </w:tcPr>
-          <w:p>
-            <w:r>
-              <w:rPr>
-                <w:sz w:val="19"/>
-              </w:rPr>
-              <w:t>Distribution frequency, execution guidelines, lifecycle and analytics</w:t>
-            </w:r>
-          </w:p>
-        </w:tc>
-        <w:tc>
-          <w:tcPr>
-            <w:tcW w:type="dxa" w:w="2088"/>
-            <w:vAlign w:val="center"/>
-          </w:tcPr>
-          <w:p>
-            <w:r>
-              <w:rPr>
-                <w:sz w:val="19"/>
-              </w:rPr>
-              <w:t>Topic 4: slide 108 onward</w:t>
-            </w:r>
-          </w:p>
-        </w:tc>
-      </w:tr>
-      <w:tr>
-        <w:trPr>
-          <w:cantSplit/>
-        </w:trPr>
-        <w:tc>
-          <w:tcPr>
-            <w:tcW w:type="dxa" w:w="1037"/>
-            <w:vAlign w:val="center"/>
-          </w:tcPr>
-          <w:p>
-            <w:r>
-              <w:rPr>
-                <w:sz w:val="19"/>
-              </w:rPr>
-              <w:t>14:45–15:00</w:t>
-            </w:r>
-          </w:p>
-        </w:tc>
-        <w:tc>
-          <w:tcPr>
-            <w:tcW w:type="dxa" w:w="893"/>
-            <w:vAlign w:val="center"/>
-          </w:tcPr>
-          <w:p>
-            <w:r>
-              <w:rPr>
-                <w:sz w:val="19"/>
-              </w:rPr>
-              <w:t>15 min</w:t>
-            </w:r>
-          </w:p>
-        </w:tc>
-        <w:tc>
-          <w:tcPr>
-            <w:tcW w:type="dxa" w:w="1037"/>
-            <w:vAlign w:val="center"/>
-          </w:tcPr>
-          <w:p>
-            <w:r>
-              <w:rPr>
-                <w:sz w:val="19"/>
-              </w:rPr>
-              <w:t>Break</w:t>
-            </w:r>
-          </w:p>
-        </w:tc>
-        <w:tc>
-          <w:tcPr>
-            <w:tcW w:type="dxa" w:w="4104"/>
-            <w:vAlign w:val="center"/>
-          </w:tcPr>
-          <w:p>
-            <w:r>
-              <w:rPr>
-                <w:sz w:val="19"/>
-              </w:rPr>
-              <w:t>Tea break</w:t>
-            </w:r>
-          </w:p>
-        </w:tc>
-        <w:tc>
-          <w:tcPr>
-            <w:tcW w:type="dxa" w:w="2088"/>
-            <w:vAlign w:val="center"/>
-          </w:tcPr>
-          <w:p>
-            <w:r>
-              <w:rPr>
-                <w:sz w:val="19"/>
-              </w:rPr>
-              <w:t>—</w:t>
-            </w:r>
-          </w:p>
-        </w:tc>
-      </w:tr>
-      <w:tr>
-        <w:trPr>
-          <w:cantSplit/>
-        </w:trPr>
-        <w:tc>
-          <w:tcPr>
-            <w:tcW w:type="dxa" w:w="1037"/>
-            <w:vAlign w:val="center"/>
-          </w:tcPr>
-          <w:p>
-            <w:r>
-              <w:rPr>
-                <w:sz w:val="19"/>
-              </w:rPr>
-              <w:t>15:00–16:00</w:t>
+              <w:t>13:30–14:30</w:t>
             </w:r>
           </w:p>
         </w:tc>
@@ -4051,7 +3182,7 @@
               <w:rPr>
                 <w:sz w:val="19"/>
               </w:rPr>
-              <w:t>Lab 9</w:t>
+              <w:t>Practical</w:t>
             </w:r>
           </w:p>
         </w:tc>
@@ -4065,7 +3196,7 @@
               <w:rPr>
                 <w:sz w:val="19"/>
               </w:rPr>
-              <w:t>Summary, Review 360 and controlled publish plan</w:t>
+              <w:t>Activities 11–13: player/review, SCORM package and xAPI release validation</w:t>
             </w:r>
           </w:p>
         </w:tc>
@@ -4079,7 +3210,7 @@
               <w:rPr>
                 <w:sz w:val="19"/>
               </w:rPr>
-              <w:t>Lab slide 132</w:t>
+              <w:t>Activity slides 397, 405, 413</w:t>
             </w:r>
           </w:p>
         </w:tc>
@@ -4098,7 +3229,7 @@
               <w:rPr>
                 <w:sz w:val="19"/>
               </w:rPr>
-              <w:t>16:00–16:30</w:t>
+              <w:t>14:30–16:30</w:t>
             </w:r>
           </w:p>
         </w:tc>
@@ -4112,7 +3243,7 @@
               <w:rPr>
                 <w:sz w:val="19"/>
               </w:rPr>
-              <w:t>30 min</w:t>
+              <w:t>120 min</w:t>
             </w:r>
           </w:p>
         </w:tc>
@@ -4126,7 +3257,7 @@
               <w:rPr>
                 <w:sz w:val="19"/>
               </w:rPr>
-              <w:t>Assessment briefing</w:t>
+              <w:t>Practical</w:t>
             </w:r>
           </w:p>
         </w:tc>
@@ -4140,7 +3271,7 @@
               <w:rPr>
                 <w:sz w:val="19"/>
               </w:rPr>
-              <w:t>Candidate instructions, evidence, reassessment and appeal</w:t>
+              <w:t>Activity 14 independent mini capstone: original 8–12 slide module, test and demonstration</w:t>
             </w:r>
           </w:p>
         </w:tc>
@@ -4154,7 +3285,7 @@
               <w:rPr>
                 <w:sz w:val="19"/>
               </w:rPr>
-              <w:t>Closing assessment slides</w:t>
+              <w:t>Activity slide 421</w:t>
             </w:r>
           </w:p>
         </w:tc>
@@ -4215,7 +3346,7 @@
               <w:rPr>
                 <w:sz w:val="19"/>
               </w:rPr>
-              <w:t>Written Assessment (WA/SAQ), open book</w:t>
+              <w:t>Approved Written Assessment (WA/SAQ), open book</w:t>
             </w:r>
           </w:p>
         </w:tc>
@@ -4290,7 +3421,7 @@
               <w:rPr>
                 <w:sz w:val="19"/>
               </w:rPr>
-              <w:t>Practical Performance (PP), open book; assessment attendance and close</w:t>
+              <w:t>Approved Practical Performance (PP), open book; formal PP is separate from capstone</w:t>
             </w:r>
           </w:p>
         </w:tc>
@@ -4320,7 +3451,7 @@
         <w:pStyle w:val="Heading1"/>
       </w:pPr>
       <w:r>
-        <w:t>Lab Alignment</w:t>
+        <w:t>Activity Alignment</w:t>
       </w:r>
     </w:p>
     <w:tbl>
@@ -4353,7 +3484,7 @@
                 <w:color w:val="FFFFFF"/>
                 <w:sz w:val="19"/>
               </w:rPr>
-              <w:t>Lab</w:t>
+              <w:t>Activity</w:t>
             </w:r>
           </w:p>
         </w:tc>
@@ -4420,7 +3551,7 @@
               <w:rPr>
                 <w:sz w:val="19"/>
               </w:rPr>
-              <w:t>Lab 01: Replace Visuals and Establish a Theme</w:t>
+              <w:t>Activity 01: Start the Safety Module and Storyboard</w:t>
             </w:r>
           </w:p>
         </w:tc>
@@ -4448,7 +3579,7 @@
               <w:rPr>
                 <w:sz w:val="19"/>
               </w:rPr>
-              <w:t>43</w:t>
+              <w:t>77</w:t>
             </w:r>
           </w:p>
         </w:tc>
@@ -4462,7 +3593,7 @@
               <w:rPr>
                 <w:sz w:val="19"/>
               </w:rPr>
-              <w:t>Both original BEGIN and END .story files remain unchanged.</w:t>
+              <w:t>Five named scenes and storyboard IDs match.</w:t>
             </w:r>
           </w:p>
         </w:tc>
@@ -4481,7 +3612,7 @@
               <w:rPr>
                 <w:sz w:val="19"/>
               </w:rPr>
-              <w:t>Lab 02: Populate the Storyboard with Course Content</w:t>
+              <w:t>Activity 02: Build Theme, Masters and Menu</w:t>
             </w:r>
           </w:p>
         </w:tc>
@@ -4509,7 +3640,7 @@
               <w:rPr>
                 <w:sz w:val="19"/>
               </w:rPr>
-              <w:t>44</w:t>
+              <w:t>85</w:t>
             </w:r>
           </w:p>
         </w:tc>
@@ -4523,7 +3654,7 @@
               <w:rPr>
                 <w:sz w:val="19"/>
               </w:rPr>
-              <w:t>The performance gap, learner action and success measure are explicit.</w:t>
+              <w:t>Four reusable layouts inherit correctly.</w:t>
             </w:r>
           </w:p>
         </w:tc>
@@ -4542,7 +3673,7 @@
               <w:rPr>
                 <w:sz w:val="19"/>
               </w:rPr>
-              <w:t>Lab 03: Curate and Replace Audience-Fit Media</w:t>
+              <w:t>Activity 03: Add Media and Hazard Scene</w:t>
             </w:r>
           </w:p>
         </w:tc>
@@ -4570,7 +3701,7 @@
               <w:rPr>
                 <w:sz w:val="19"/>
               </w:rPr>
-              <w:t>74</w:t>
+              <w:t>204</w:t>
             </w:r>
           </w:p>
         </w:tc>
@@ -4584,7 +3715,7 @@
               <w:rPr>
                 <w:sz w:val="19"/>
               </w:rPr>
-              <w:t>Visual choices trace to audience requirements.</w:t>
+              <w:t>Seven hazards are visually plausible.</w:t>
             </w:r>
           </w:p>
         </w:tc>
@@ -4603,7 +3734,7 @@
               <w:rPr>
                 <w:sz w:val="19"/>
               </w:rPr>
-              <w:t>Lab 04: Create and Govern an AI-Assisted Visual Variation</w:t>
+              <w:t>Activity 04: Add Layers, States, Variables and Gate</w:t>
             </w:r>
           </w:p>
         </w:tc>
@@ -4631,7 +3762,7 @@
               <w:rPr>
                 <w:sz w:val="19"/>
               </w:rPr>
-              <w:t>75</w:t>
+              <w:t>212</w:t>
             </w:r>
           </w:p>
         </w:tc>
@@ -4645,7 +3776,7 @@
               <w:rPr>
                 <w:sz w:val="19"/>
               </w:rPr>
-              <w:t>A baseline remains available for comparison.</w:t>
+              <w:t>Counter never exceeds seven.</w:t>
             </w:r>
           </w:p>
         </w:tc>
@@ -4664,7 +3795,7 @@
               <w:rPr>
                 <w:sz w:val="19"/>
               </w:rPr>
-              <w:t>Lab 05: Add Narration and Closed Captions</w:t>
+              <w:t>Activity 05: Build Motion, Slider and Dial Controls</w:t>
             </w:r>
           </w:p>
         </w:tc>
@@ -4692,7 +3823,7 @@
               <w:rPr>
                 <w:sz w:val="19"/>
               </w:rPr>
-              <w:t>76</w:t>
+              <w:t>220</w:t>
             </w:r>
           </w:p>
         </w:tc>
@@ -4706,7 +3837,7 @@
               <w:rPr>
                 <w:sz w:val="19"/>
               </w:rPr>
-              <w:t>Narration is intelligible, synchronised and free of avoidable recording distractions.</w:t>
+              <w:t>Motion is learner-controlled.</w:t>
             </w:r>
           </w:p>
         </w:tc>
@@ -4725,7 +3856,7 @@
               <w:rPr>
                 <w:sz w:val="19"/>
               </w:rPr>
-              <w:t>Lab 06: Build a Multi-Slide Audio and Caption System</w:t>
+              <w:t>Activity 06: Create View, Try and Test Simulations</w:t>
             </w:r>
           </w:p>
         </w:tc>
@@ -4753,7 +3884,7 @@
               <w:rPr>
                 <w:sz w:val="19"/>
               </w:rPr>
-              <w:t>77</w:t>
+              <w:t>228</w:t>
             </w:r>
           </w:p>
         </w:tc>
@@ -4767,7 +3898,7 @@
               <w:rPr>
                 <w:sz w:val="19"/>
               </w:rPr>
-              <w:t>All audio, captions and transcript equivalents map to the correct slides.</w:t>
+              <w:t>Recording exposes no private data.</w:t>
             </w:r>
           </w:p>
         </w:tc>
@@ -4786,7 +3917,68 @@
               <w:rPr>
                 <w:sz w:val="19"/>
               </w:rPr>
-              <w:t>Lab 07: Build a Graded Question with Feedback</w:t>
+              <w:t>Activity 07: Add Audio, Captions and Accessibility</w:t>
+            </w:r>
+          </w:p>
+        </w:tc>
+        <w:tc>
+          <w:tcPr>
+            <w:tcW w:type="dxa" w:w="1944"/>
+            <w:vAlign w:val="center"/>
+          </w:tcPr>
+          <w:p>
+            <w:r>
+              <w:rPr>
+                <w:sz w:val="19"/>
+              </w:rPr>
+              <w:t>Topic 2 · LO2 · A3 · A5 · K2 · K5</w:t>
+            </w:r>
+          </w:p>
+        </w:tc>
+        <w:tc>
+          <w:tcPr>
+            <w:tcW w:type="dxa" w:w="720"/>
+            <w:vAlign w:val="center"/>
+          </w:tcPr>
+          <w:p>
+            <w:r>
+              <w:rPr>
+                <w:sz w:val="19"/>
+              </w:rPr>
+              <w:t>236</w:t>
+            </w:r>
+          </w:p>
+        </w:tc>
+        <w:tc>
+          <w:tcPr>
+            <w:tcW w:type="dxa" w:w="4320"/>
+            <w:vAlign w:val="center"/>
+          </w:tcPr>
+          <w:p>
+            <w:r>
+              <w:rPr>
+                <w:sz w:val="19"/>
+              </w:rPr>
+              <w:t>Narration and captions synchronise.</w:t>
+            </w:r>
+          </w:p>
+        </w:tc>
+      </w:tr>
+      <w:tr>
+        <w:trPr>
+          <w:cantSplit/>
+        </w:trPr>
+        <w:tc>
+          <w:tcPr>
+            <w:tcW w:type="dxa" w:w="2232"/>
+            <w:vAlign w:val="center"/>
+          </w:tcPr>
+          <w:p>
+            <w:r>
+              <w:rPr>
+                <w:sz w:val="19"/>
+              </w:rPr>
+              <w:t>Activity 08: Build Branching and Freeform Decisions</w:t>
             </w:r>
           </w:p>
         </w:tc>
@@ -4814,7 +4006,7 @@
               <w:rPr>
                 <w:sz w:val="19"/>
               </w:rPr>
-              <w:t>105</w:t>
+              <w:t>298</w:t>
             </w:r>
           </w:p>
         </w:tc>
@@ -4828,7 +4020,7 @@
               <w:rPr>
                 <w:sz w:val="19"/>
               </w:rPr>
-              <w:t>The realistic decision and consequence-based feedback align to the taught criterion.</w:t>
+              <w:t>All branches reach feedback and continuation.</w:t>
             </w:r>
           </w:p>
         </w:tc>
@@ -4847,7 +4039,7 @@
               <w:rPr>
                 <w:sz w:val="19"/>
               </w:rPr>
-              <w:t>Lab 08: Build a Multi-Question Quiz and Result Logic</w:t>
+              <w:t>Activity 09: Build the Safety Question Bank and Quiz</w:t>
             </w:r>
           </w:p>
         </w:tc>
@@ -4875,7 +4067,7 @@
               <w:rPr>
                 <w:sz w:val="19"/>
               </w:rPr>
-              <w:t>106</w:t>
+              <w:t>306</w:t>
             </w:r>
           </w:p>
         </w:tc>
@@ -4889,7 +4081,7 @@
               <w:rPr>
                 <w:sz w:val="19"/>
               </w:rPr>
-              <w:t>Both questions assess the mapped criteria through meaningful learner choices.</w:t>
+              <w:t>Five criteria are covered.</w:t>
             </w:r>
           </w:p>
         </w:tc>
@@ -4908,7 +4100,68 @@
               <w:rPr>
                 <w:sz w:val="19"/>
               </w:rPr>
-              <w:t>Lab 09: Add a Summary, Review and Publish Plan</w:t>
+              <w:t>Activity 10: Configure Results, Retry and Completion</w:t>
+            </w:r>
+          </w:p>
+        </w:tc>
+        <w:tc>
+          <w:tcPr>
+            <w:tcW w:type="dxa" w:w="1944"/>
+            <w:vAlign w:val="center"/>
+          </w:tcPr>
+          <w:p>
+            <w:r>
+              <w:rPr>
+                <w:sz w:val="19"/>
+              </w:rPr>
+              <w:t>Topic 3 · LO3 · A6 · K6</w:t>
+            </w:r>
+          </w:p>
+        </w:tc>
+        <w:tc>
+          <w:tcPr>
+            <w:tcW w:type="dxa" w:w="720"/>
+            <w:vAlign w:val="center"/>
+          </w:tcPr>
+          <w:p>
+            <w:r>
+              <w:rPr>
+                <w:sz w:val="19"/>
+              </w:rPr>
+              <w:t>314</w:t>
+            </w:r>
+          </w:p>
+        </w:tc>
+        <w:tc>
+          <w:tcPr>
+            <w:tcW w:type="dxa" w:w="4320"/>
+            <w:vAlign w:val="center"/>
+          </w:tcPr>
+          <w:p>
+            <w:r>
+              <w:rPr>
+                <w:sz w:val="19"/>
+              </w:rPr>
+              <w:t>80% threshold is exact.</w:t>
+            </w:r>
+          </w:p>
+        </w:tc>
+      </w:tr>
+      <w:tr>
+        <w:trPr>
+          <w:cantSplit/>
+        </w:trPr>
+        <w:tc>
+          <w:tcPr>
+            <w:tcW w:type="dxa" w:w="2232"/>
+            <w:vAlign w:val="center"/>
+          </w:tcPr>
+          <w:p>
+            <w:r>
+              <w:rPr>
+                <w:sz w:val="19"/>
+              </w:rPr>
+              <w:t>Activity 11: Configure Player, Translation and Review 360</w:t>
             </w:r>
           </w:p>
         </w:tc>
@@ -4936,7 +4189,7 @@
               <w:rPr>
                 <w:sz w:val="19"/>
               </w:rPr>
-              <w:t>132</w:t>
+              <w:t>397</w:t>
             </w:r>
           </w:p>
         </w:tc>
@@ -4950,14 +4203,197 @@
               <w:rPr>
                 <w:sz w:val="19"/>
               </w:rPr>
-              <w:t>The summary communicates the intended actions and next step.</w:t>
+              <w:t>Player controls are keyboard accessible.</w:t>
+            </w:r>
+          </w:p>
+        </w:tc>
+      </w:tr>
+      <w:tr>
+        <w:trPr>
+          <w:cantSplit/>
+        </w:trPr>
+        <w:tc>
+          <w:tcPr>
+            <w:tcW w:type="dxa" w:w="2232"/>
+            <w:vAlign w:val="center"/>
+          </w:tcPr>
+          <w:p>
+            <w:r>
+              <w:rPr>
+                <w:sz w:val="19"/>
+              </w:rPr>
+              <w:t>Activity 12: Publish and Test SCORM 1.2 and 2004</w:t>
+            </w:r>
+          </w:p>
+        </w:tc>
+        <w:tc>
+          <w:tcPr>
+            <w:tcW w:type="dxa" w:w="1944"/>
+            <w:vAlign w:val="center"/>
+          </w:tcPr>
+          <w:p>
+            <w:r>
+              <w:rPr>
+                <w:sz w:val="19"/>
+              </w:rPr>
+              <w:t>Topic 4 · LO4 · A4 · A7 · K4</w:t>
+            </w:r>
+          </w:p>
+        </w:tc>
+        <w:tc>
+          <w:tcPr>
+            <w:tcW w:type="dxa" w:w="720"/>
+            <w:vAlign w:val="center"/>
+          </w:tcPr>
+          <w:p>
+            <w:r>
+              <w:rPr>
+                <w:sz w:val="19"/>
+              </w:rPr>
+              <w:t>405</w:t>
+            </w:r>
+          </w:p>
+        </w:tc>
+        <w:tc>
+          <w:tcPr>
+            <w:tcW w:type="dxa" w:w="4320"/>
+            <w:vAlign w:val="center"/>
+          </w:tcPr>
+          <w:p>
+            <w:r>
+              <w:rPr>
+                <w:sz w:val="19"/>
+              </w:rPr>
+              <w:t>Two distinct packages and setting records exist.</w:t>
+            </w:r>
+          </w:p>
+        </w:tc>
+      </w:tr>
+      <w:tr>
+        <w:trPr>
+          <w:cantSplit/>
+        </w:trPr>
+        <w:tc>
+          <w:tcPr>
+            <w:tcW w:type="dxa" w:w="2232"/>
+            <w:vAlign w:val="center"/>
+          </w:tcPr>
+          <w:p>
+            <w:r>
+              <w:rPr>
+                <w:sz w:val="19"/>
+              </w:rPr>
+              <w:t>Activity 13: Publish Tin Can xAPI and Validate Release</w:t>
+            </w:r>
+          </w:p>
+        </w:tc>
+        <w:tc>
+          <w:tcPr>
+            <w:tcW w:type="dxa" w:w="1944"/>
+            <w:vAlign w:val="center"/>
+          </w:tcPr>
+          <w:p>
+            <w:r>
+              <w:rPr>
+                <w:sz w:val="19"/>
+              </w:rPr>
+              <w:t>Topic 4 · LO4 · A4 · A7 · K4</w:t>
+            </w:r>
+          </w:p>
+        </w:tc>
+        <w:tc>
+          <w:tcPr>
+            <w:tcW w:type="dxa" w:w="720"/>
+            <w:vAlign w:val="center"/>
+          </w:tcPr>
+          <w:p>
+            <w:r>
+              <w:rPr>
+                <w:sz w:val="19"/>
+              </w:rPr>
+              <w:t>413</w:t>
+            </w:r>
+          </w:p>
+        </w:tc>
+        <w:tc>
+          <w:tcPr>
+            <w:tcW w:type="dxa" w:w="4320"/>
+            <w:vAlign w:val="center"/>
+          </w:tcPr>
+          <w:p>
+            <w:r>
+              <w:rPr>
+                <w:sz w:val="19"/>
+              </w:rPr>
+              <w:t>No credential appears in the package.</w:t>
+            </w:r>
+          </w:p>
+        </w:tc>
+      </w:tr>
+      <w:tr>
+        <w:trPr>
+          <w:cantSplit/>
+        </w:trPr>
+        <w:tc>
+          <w:tcPr>
+            <w:tcW w:type="dxa" w:w="2232"/>
+            <w:vAlign w:val="center"/>
+          </w:tcPr>
+          <w:p>
+            <w:r>
+              <w:rPr>
+                <w:sz w:val="19"/>
+              </w:rPr>
+              <w:t>Activity 14: Independent Mini Capstone</w:t>
+            </w:r>
+          </w:p>
+        </w:tc>
+        <w:tc>
+          <w:tcPr>
+            <w:tcW w:type="dxa" w:w="1944"/>
+            <w:vAlign w:val="center"/>
+          </w:tcPr>
+          <w:p>
+            <w:r>
+              <w:rPr>
+                <w:sz w:val="19"/>
+              </w:rPr>
+              <w:t>Topic 4 · LO4 · A4 · A7 · K4</w:t>
+            </w:r>
+          </w:p>
+        </w:tc>
+        <w:tc>
+          <w:tcPr>
+            <w:tcW w:type="dxa" w:w="720"/>
+            <w:vAlign w:val="center"/>
+          </w:tcPr>
+          <w:p>
+            <w:r>
+              <w:rPr>
+                <w:sz w:val="19"/>
+              </w:rPr>
+              <w:t>421</w:t>
+            </w:r>
+          </w:p>
+        </w:tc>
+        <w:tc>
+          <w:tcPr>
+            <w:tcW w:type="dxa" w:w="4320"/>
+            <w:vAlign w:val="center"/>
+          </w:tcPr>
+          <w:p>
+            <w:r>
+              <w:rPr>
+                <w:sz w:val="19"/>
+              </w:rPr>
+              <w:t>Original blank project and brief are evident.</w:t>
             </w:r>
           </w:p>
         </w:tc>
       </w:tr>
     </w:tbl>
     <w:sectPr>
-      <w:footerReference w:type="default" r:id="rId10"/>
+      <w:footerReference w:type="default" r:id="rId11"/>
       <w:pgSz w:w="12240" w:h="15840"/>
       <w:pgMar w:top="1440" w:right="1800" w:bottom="1440" w:left="1800" w:header="720" w:footer="720" w:gutter="0"/>
       <w:cols w:space="720"/>

</xml_diff>